<commit_message>
ports updated on docx, and unnecessary files are removed
</commit_message>
<xml_diff>
--- a/docs/report/Observability_Technical_Report_EN_v1.5.docx
+++ b/docs/report/Observability_Technical_Report_EN_v1.5.docx
@@ -1167,7 +1167,26 @@
           <w:szCs w:val="22"/>
           <w:highlight w:val="yellow"/>
         </w:rPr>
-        <w:t>OTLP receiver (both gRPC:4317 and HTTP:4318) requires a Bearer token</w:t>
+        <w:t>OTLP receiver (both gRPC:</w:t>
+      </w:r>
+      <w:r>
+        <w:rPr>
+          <w:rFonts w:cs="Calibri"/>
+          <w:sz w:val="22"/>
+          <w:szCs w:val="22"/>
+          <w:highlight w:val="yellow"/>
+          <w:lang w:val="tr-TR"/>
+        </w:rPr>
+        <w:t>5317</w:t>
+      </w:r>
+      <w:r>
+        <w:rPr>
+          <w:rFonts w:ascii="Calibri" w:hAnsi="Calibri" w:eastAsia="Calibri" w:cs="Calibri"/>
+          <w:sz w:val="22"/>
+          <w:szCs w:val="22"/>
+          <w:highlight w:val="yellow"/>
+        </w:rPr>
+        <w:t xml:space="preserve"> and HTTP:4318) requires a Bearer token</w:t>
       </w:r>
       <w:r>
         <w:rPr>
@@ -1204,7 +1223,17 @@
           <w:sz w:val="22"/>
           <w:szCs w:val="22"/>
         </w:rPr>
-        <w:t xml:space="preserve">otel-collector/config.yaml defines three pipelines, all sharing the same OTLP receiver but exporting to different backends: </w:t>
+        <w:t>otel-collector/config.yaml de</w:t>
+      </w:r>
+      <w:bookmarkStart w:id="0" w:name="_GoBack"/>
+      <w:bookmarkEnd w:id="0"/>
+      <w:r>
+        <w:rPr>
+          <w:rFonts w:ascii="Calibri" w:hAnsi="Calibri" w:eastAsia="Calibri" w:cs="Calibri"/>
+          <w:sz w:val="22"/>
+          <w:szCs w:val="22"/>
+        </w:rPr>
+        <w:t xml:space="preserve">fines three pipelines, all sharing the same OTLP receiver but exporting to different backends: </w:t>
       </w:r>
     </w:p>
     <w:p>
@@ -3720,12 +3749,6 @@
             <w:insideH w:val="single" w:color="auto" w:sz="4" w:space="0"/>
             <w:insideV w:val="single" w:color="auto" w:sz="4" w:space="0"/>
           </w:tblBorders>
-          <w:tblCellMar>
-            <w:top w:w="0" w:type="dxa"/>
-            <w:left w:w="10" w:type="dxa"/>
-            <w:bottom w:w="0" w:type="dxa"/>
-            <w:right w:w="10" w:type="dxa"/>
-          </w:tblCellMar>
         </w:tblPrEx>
         <w:trPr>
           <w:tblHeader/>
@@ -4860,7 +4883,24 @@
           <w:sz w:val="22"/>
           <w:szCs w:val="22"/>
         </w:rPr>
-        <w:t>The contract requires TLS + Bearer token on the OTLP connection. As of this build, the collector's bearertokenauth extension enforces the Bearer token on both gRPC (4317) and HTTP (4318) — every KIO in docker-compose.yml now sends OTEL_EXPORTER_OTLP_HEADERS with a shared token (OTLP_BEARER_TOKEN, overridable via .env), and no code change was needed for this since the OTel SDK reads that variable on its own. TLS itself is intentionally still not enabled — the connection is authenticated but not encrypted, which is adequate for a trusted LAN/VPN but not for the open internet. Real TLS (certificates on the collector, insecure=False on every client) is left for an actual remote/production deployment; adding self-signed certificates to this docker-compose would add complexity without a real trust boundary to justify it yet.</w:t>
+        <w:t>The contract requires TLS + Bearer token on the OTLP connection. As of this build, the collector's bearertokenauth extension enforces the Bearer token on both gRPC (</w:t>
+      </w:r>
+      <w:r>
+        <w:rPr>
+          <w:rFonts w:cs="Calibri"/>
+          <w:sz w:val="22"/>
+          <w:szCs w:val="22"/>
+          <w:lang w:val="tr-TR"/>
+        </w:rPr>
+        <w:t>5317</w:t>
+      </w:r>
+      <w:r>
+        <w:rPr>
+          <w:rFonts w:ascii="Calibri" w:hAnsi="Calibri" w:eastAsia="Calibri" w:cs="Calibri"/>
+          <w:sz w:val="22"/>
+          <w:szCs w:val="22"/>
+        </w:rPr>
+        <w:t>) and HTTP (4318) — every KIO in docker-compose.yml now sends OTEL_EXPORTER_OTLP_HEADERS with a shared token (OTLP_BEARER_TOKEN, overridable via .env), and no code change was needed for this since the OTel SDK reads that variable on its own. TLS itself is intentionally still not enabled — the connection is authenticated but not encrypted, which is adequate for a trusted LAN/VPN but not for the open internet. Real TLS (certificates on the collector, insecure=False on every client) is left for an actual remote/production deployment; adding self-signed certificates to this docker-compose would add complexity without a real trust boundary to justify it yet.</w:t>
       </w:r>
     </w:p>
     <w:p>
@@ -6975,10 +7015,7 @@
         </w:tc>
       </w:tr>
     </w:tbl>
-    <w:p>
-      <w:bookmarkStart w:id="0" w:name="_GoBack"/>
-      <w:bookmarkEnd w:id="0"/>
-    </w:p>
+    <w:p/>
     <w:sectPr>
       <w:headerReference r:id="rId3" w:type="default"/>
       <w:footerReference r:id="rId4" w:type="default"/>
@@ -7204,7 +7241,7 @@
     <w:lsdException w:unhideWhenUsed="0" w:uiPriority="0" w:semiHidden="0" w:name="toc 8"/>
     <w:lsdException w:unhideWhenUsed="0" w:uiPriority="0" w:semiHidden="0" w:name="toc 9"/>
     <w:lsdException w:unhideWhenUsed="0" w:uiPriority="0" w:semiHidden="0" w:name="Normal Indent"/>
-    <w:lsdException w:uiPriority="99" w:name="footnote text"/>
+    <w:lsdException w:qFormat="1" w:uiPriority="99" w:name="footnote text"/>
     <w:lsdException w:unhideWhenUsed="0" w:uiPriority="0" w:semiHidden="0" w:name="annotation text"/>
     <w:lsdException w:unhideWhenUsed="0" w:uiPriority="0" w:semiHidden="0" w:name="header"/>
     <w:lsdException w:unhideWhenUsed="0" w:uiPriority="0" w:semiHidden="0" w:name="footer"/>
@@ -7587,6 +7624,7 @@
     <w:link w:val="17"/>
     <w:semiHidden/>
     <w:unhideWhenUsed/>
+    <w:qFormat/>
     <w:uiPriority w:val="99"/>
     <w:pPr>
       <w:spacing w:after="0" w:line="240" w:lineRule="auto"/>
@@ -7632,6 +7670,7 @@
     <w:link w:val="13"/>
     <w:semiHidden/>
     <w:unhideWhenUsed/>
+    <w:qFormat/>
     <w:uiPriority w:val="99"/>
     <w:rPr>
       <w:sz w:val="20"/>

</xml_diff>